<commit_message>
Added to my portion of docuemnt. Properly merged other copy of document.
</commit_message>
<xml_diff>
--- a/docs/Group3_Phase2_Source_Code_Report_Breakout.docx
+++ b/docs/Group3_Phase2_Source_Code_Report_Breakout.docx
@@ -78,8 +78,6 @@
       </w:r>
       <w:r>
         <w:br/>
-      </w:r>
-      <w:r>
         <w:t>Course Deliverable: Phase II Source Code Submission</w:t>
       </w:r>
       <w:r>
@@ -250,15 +248,7 @@
             </w:r>
             <w:proofErr w:type="spellEnd"/>
             <w:r>
-              <w:t xml:space="preserve"> preset workflow (`CMakeLists.txt`, `</w:t>
-            </w:r>
-            <w:proofErr w:type="spellStart"/>
-            <w:r>
-              <w:t>CMakePresets.json</w:t>
-            </w:r>
-            <w:proofErr w:type="spellEnd"/>
-            <w:r>
-              <w:t xml:space="preserve">`). The repository documents both local script-based builds and </w:t>
+              <w:t xml:space="preserve"> preset workflow (`CMakeLists.txt`, `CMakePresets.json`). The repository documents both local script-based builds and </w:t>
             </w:r>
             <w:proofErr w:type="spellStart"/>
             <w:r>
@@ -365,14 +355,9 @@
       <w:r>
         <w:t xml:space="preserve">The purpose of this document is to explain what was completed during Phase II, how the final repository is organized, the standards applied to the code and supporting materials, and how the team verified that </w:t>
       </w:r>
-      <w:proofErr w:type="gramStart"/>
       <w:r>
         <w:lastRenderedPageBreak/>
-        <w:t>the</w:t>
-      </w:r>
-      <w:proofErr w:type="gramEnd"/>
-      <w:r>
-        <w:t xml:space="preserve"> current implementation satisfies the project requirements. This report reflects the repository state on the `main` branch at commit `f977c8c34c3a887359a88b0856ff573e3cb57b11`.</w:t>
+        <w:t>the current implementation satisfies the project requirements. This report reflects the repository state on the `main` branch at commit `f977c8c34c3a887359a88b0856ff573e3cb57b11`.</w:t>
       </w:r>
     </w:p>
     <w:p>
@@ -1029,67 +1014,11 @@
       </w:r>
       <w:proofErr w:type="gramStart"/>
       <w:r>
-        <w:t>`</w:t>
-      </w:r>
-      <w:proofErr w:type="spellStart"/>
-      <w:r>
-        <w:t>GameConstants.h</w:t>
-      </w:r>
-      <w:proofErr w:type="spellEnd"/>
-      <w:r>
-        <w:t>`</w:t>
+        <w:t>`GameConstants.h`</w:t>
       </w:r>
       <w:proofErr w:type="gramEnd"/>
       <w:r>
-        <w:t xml:space="preserve"> stores tunable values for the window, paddle, ball, and brick layout. `</w:t>
-      </w:r>
-      <w:proofErr w:type="spellStart"/>
-      <w:r>
-        <w:t>GameHelpers.h</w:t>
-      </w:r>
-      <w:proofErr w:type="spellEnd"/>
-      <w:r>
-        <w:t>` contains small deterministic helper functions. `</w:t>
-      </w:r>
-      <w:proofErr w:type="spellStart"/>
-      <w:r>
-        <w:t>src</w:t>
-      </w:r>
-      <w:proofErr w:type="spellEnd"/>
-      <w:r>
-        <w:t>/</w:t>
-      </w:r>
-      <w:proofErr w:type="spellStart"/>
-      <w:r>
-        <w:t>PhysicsManager.h</w:t>
-      </w:r>
-      <w:proofErr w:type="spellEnd"/>
-      <w:r>
-        <w:t>` manages ball velocity and axis reflection behavior. `</w:t>
-      </w:r>
-      <w:proofErr w:type="spellStart"/>
-      <w:r>
-        <w:t>src</w:t>
-      </w:r>
-      <w:proofErr w:type="spellEnd"/>
-      <w:r>
-        <w:t>/</w:t>
-      </w:r>
-      <w:proofErr w:type="spellStart"/>
-      <w:r>
-        <w:t>GameManager.h</w:t>
-      </w:r>
-      <w:proofErr w:type="spellEnd"/>
-      <w:r>
-        <w:t>` and `</w:t>
-      </w:r>
-      <w:proofErr w:type="spellStart"/>
-      <w:r>
-        <w:t>src</w:t>
-      </w:r>
-      <w:proofErr w:type="spellEnd"/>
-      <w:r>
-        <w:t xml:space="preserve">/GameManager.cpp` manage lives and game-state tracking. The repository now also includes a </w:t>
+        <w:t xml:space="preserve"> stores tunable values for the window, paddle, ball, and brick layout. `GameHelpers.h` contains small deterministic helper functions. `src/PhysicsManager.h` manages ball velocity and axis reflection behavior. `src/GameManager.h` and `src/GameManager.cpp` manage lives and game-state tracking. The repository now also includes a </w:t>
       </w:r>
       <w:proofErr w:type="spellStart"/>
       <w:r>
@@ -1344,15 +1273,7 @@
           </w:tcPr>
           <w:p>
             <w:r>
-              <w:t>`scripts/Resolve-Toolchain.ps1`, `scripts/build-phase1.ps1`, `CMakeLists.txt`, `</w:t>
-            </w:r>
-            <w:proofErr w:type="spellStart"/>
-            <w:r>
-              <w:t>CMakePresets.json</w:t>
-            </w:r>
-            <w:proofErr w:type="spellEnd"/>
-            <w:r>
-              <w:t>`</w:t>
+              <w:t>`scripts/Resolve-Toolchain.ps1`, `scripts/build-phase1.ps1`, `CMakeLists.txt`, `CMakePresets.json`</w:t>
             </w:r>
           </w:p>
         </w:tc>
@@ -1860,84 +1781,380 @@
     </w:p>
     <w:p>
       <w:r>
-        <w:t>The final submission continues to use the root-level gameplay code path originally established in Phase I. The active entry point is `phase1_main.cpp`, which launches the `Game` implementation in `</w:t>
+        <w:t>The final submission continues to use the root-level gameplay code path originally established in Phase I. The active entry point is `phase1_main.cpp`, which launches the `Game` implementation in `Game.h` and `Game.cpp`. That code depends on `GameConstants.h`, `GameHelpers.h`, `src/GameManager.h`, `src/GameManager.cpp`, and `src/PhysicsManager.h`. Supporting assets are stored in `assets/`, project documentation is stored in `docs/`, and automated tests now live in `tests/`.</w:t>
+      </w:r>
+    </w:p>
+    <w:p>
+      <w:pPr>
+        <w:spacing w:after="0"/>
+      </w:pPr>
+      <w:r>
+        <w:t>BreakoutGame/</w:t>
+      </w:r>
+    </w:p>
+    <w:p>
+      <w:pPr>
+        <w:spacing w:after="0"/>
+      </w:pPr>
+      <w:r>
+        <w:rPr>
+          <w:rFonts w:ascii="MS Gothic" w:eastAsia="MS Gothic" w:hAnsi="MS Gothic" w:cs="MS Gothic"/>
+        </w:rPr>
+        <w:t>├</w:t>
+      </w:r>
+      <w:r>
+        <w:t>── .vscode/</w:t>
+      </w:r>
+    </w:p>
+    <w:p>
+      <w:pPr>
+        <w:spacing w:after="0"/>
+      </w:pPr>
+      <w:r>
+        <w:rPr>
+          <w:rFonts w:ascii="MS Gothic" w:eastAsia="MS Gothic" w:hAnsi="MS Gothic" w:cs="MS Gothic"/>
+        </w:rPr>
+        <w:t>├</w:t>
+      </w:r>
+      <w:r>
+        <w:t>── assets/</w:t>
+      </w:r>
+    </w:p>
+    <w:p>
+      <w:pPr>
+        <w:spacing w:after="0"/>
+      </w:pPr>
+      <w:r>
+        <w:t>│   └── fonts/</w:t>
+      </w:r>
+    </w:p>
+    <w:p>
+      <w:pPr>
+        <w:spacing w:after="0"/>
+      </w:pPr>
+      <w:r>
+        <w:rPr>
+          <w:rFonts w:ascii="MS Gothic" w:eastAsia="MS Gothic" w:hAnsi="MS Gothic" w:cs="MS Gothic"/>
+        </w:rPr>
+        <w:t>├</w:t>
+      </w:r>
+      <w:r>
+        <w:t>── docs/</w:t>
+      </w:r>
+    </w:p>
+    <w:p>
+      <w:pPr>
+        <w:spacing w:after="0"/>
+      </w:pPr>
+      <w:r>
+        <w:t xml:space="preserve">│   </w:t>
+      </w:r>
+      <w:r>
+        <w:rPr>
+          <w:rFonts w:ascii="MS Gothic" w:eastAsia="MS Gothic" w:hAnsi="MS Gothic" w:cs="MS Gothic"/>
+        </w:rPr>
+        <w:t>├</w:t>
+      </w:r>
+      <w:r>
+        <w:t>── 00_master/</w:t>
+      </w:r>
+    </w:p>
+    <w:p>
+      <w:pPr>
+        <w:spacing w:after="0"/>
+      </w:pPr>
+      <w:r>
+        <w:t xml:space="preserve">│   </w:t>
+      </w:r>
+      <w:r>
+        <w:rPr>
+          <w:rFonts w:ascii="MS Gothic" w:eastAsia="MS Gothic" w:hAnsi="MS Gothic" w:cs="MS Gothic"/>
+        </w:rPr>
+        <w:t>├</w:t>
+      </w:r>
+      <w:r>
+        <w:t>── 01_features/</w:t>
+      </w:r>
+    </w:p>
+    <w:p>
+      <w:pPr>
+        <w:spacing w:after="0"/>
+      </w:pPr>
+      <w:r>
+        <w:t>│   └── 02_management/</w:t>
+      </w:r>
+    </w:p>
+    <w:p>
+      <w:pPr>
+        <w:spacing w:after="0"/>
+      </w:pPr>
+      <w:r>
+        <w:t xml:space="preserve">│       </w:t>
+      </w:r>
+      <w:r>
+        <w:rPr>
+          <w:rFonts w:ascii="MS Gothic" w:eastAsia="MS Gothic" w:hAnsi="MS Gothic" w:cs="MS Gothic"/>
+        </w:rPr>
+        <w:t>├</w:t>
+      </w:r>
+      <w:r>
+        <w:t>── Phase1_Source_Summary.md</w:t>
+      </w:r>
+    </w:p>
+    <w:p>
+      <w:pPr>
+        <w:spacing w:after="0"/>
+      </w:pPr>
+      <w:r>
+        <w:t xml:space="preserve">│       </w:t>
+      </w:r>
+      <w:r>
+        <w:rPr>
+          <w:rFonts w:ascii="MS Gothic" w:eastAsia="MS Gothic" w:hAnsi="MS Gothic" w:cs="MS Gothic"/>
+        </w:rPr>
+        <w:t>├</w:t>
+      </w:r>
+      <w:r>
+        <w:t>── Phase1_Test_Checklist.md</w:t>
+      </w:r>
+    </w:p>
+    <w:p>
+      <w:pPr>
+        <w:spacing w:after="0"/>
+      </w:pPr>
+      <w:r>
+        <w:lastRenderedPageBreak/>
+        <w:t>│       └── unit_test_cases.md</w:t>
+      </w:r>
+    </w:p>
+    <w:p>
+      <w:pPr>
+        <w:spacing w:after="0"/>
+      </w:pPr>
+      <w:r>
+        <w:rPr>
+          <w:rFonts w:ascii="MS Gothic" w:eastAsia="MS Gothic" w:hAnsi="MS Gothic" w:cs="MS Gothic"/>
+        </w:rPr>
+        <w:t>├</w:t>
+      </w:r>
+      <w:r>
+        <w:t>── scripts/</w:t>
+      </w:r>
+    </w:p>
+    <w:p>
+      <w:pPr>
+        <w:spacing w:after="0"/>
+      </w:pPr>
+      <w:r>
+        <w:t xml:space="preserve">│   </w:t>
+      </w:r>
+      <w:r>
+        <w:rPr>
+          <w:rFonts w:ascii="MS Gothic" w:eastAsia="MS Gothic" w:hAnsi="MS Gothic" w:cs="MS Gothic"/>
+        </w:rPr>
+        <w:t>├</w:t>
+      </w:r>
+      <w:r>
+        <w:t>── Resolve-Toolchain.ps1</w:t>
+      </w:r>
+    </w:p>
+    <w:p>
+      <w:pPr>
+        <w:spacing w:after="0"/>
+      </w:pPr>
+      <w:r>
+        <w:t xml:space="preserve">│   </w:t>
+      </w:r>
+      <w:r>
+        <w:rPr>
+          <w:rFonts w:ascii="MS Gothic" w:eastAsia="MS Gothic" w:hAnsi="MS Gothic" w:cs="MS Gothic"/>
+        </w:rPr>
+        <w:t>├</w:t>
+      </w:r>
+      <w:r>
+        <w:t>── build-phase1.ps1</w:t>
+      </w:r>
+    </w:p>
+    <w:p>
+      <w:pPr>
+        <w:spacing w:after="0"/>
+      </w:pPr>
+      <w:r>
+        <w:t>│   └── run-game.ps1</w:t>
+      </w:r>
+    </w:p>
+    <w:p>
+      <w:pPr>
+        <w:spacing w:after="0"/>
+      </w:pPr>
+      <w:r>
+        <w:rPr>
+          <w:rFonts w:ascii="MS Gothic" w:eastAsia="MS Gothic" w:hAnsi="MS Gothic" w:cs="MS Gothic"/>
+        </w:rPr>
+        <w:t>├</w:t>
+      </w:r>
+      <w:r>
+        <w:t>── src/</w:t>
+      </w:r>
+    </w:p>
+    <w:p>
+      <w:pPr>
+        <w:spacing w:after="0"/>
+      </w:pPr>
+      <w:r>
+        <w:t xml:space="preserve">│   </w:t>
+      </w:r>
+      <w:r>
+        <w:rPr>
+          <w:rFonts w:ascii="MS Gothic" w:eastAsia="MS Gothic" w:hAnsi="MS Gothic" w:cs="MS Gothic"/>
+        </w:rPr>
+        <w:t>├</w:t>
+      </w:r>
+      <w:r>
+        <w:t>── Block.cpp</w:t>
+      </w:r>
+    </w:p>
+    <w:p>
+      <w:pPr>
+        <w:spacing w:after="0"/>
+      </w:pPr>
+      <w:r>
+        <w:t xml:space="preserve">│   </w:t>
+      </w:r>
+      <w:r>
+        <w:rPr>
+          <w:rFonts w:ascii="MS Gothic" w:eastAsia="MS Gothic" w:hAnsi="MS Gothic" w:cs="MS Gothic"/>
+        </w:rPr>
+        <w:t>├</w:t>
+      </w:r>
+      <w:r>
+        <w:t xml:space="preserve">── </w:t>
       </w:r>
       <w:proofErr w:type="spellStart"/>
       <w:r>
-        <w:t>Game.h</w:t>
+        <w:t>Block.h</w:t>
       </w:r>
       <w:proofErr w:type="spellEnd"/>
-      <w:r>
-        <w:t>` and `Game.cpp`. That code depends on `</w:t>
+    </w:p>
+    <w:p>
+      <w:pPr>
+        <w:spacing w:after="0"/>
+      </w:pPr>
+      <w:r>
+        <w:t xml:space="preserve">│   </w:t>
+      </w:r>
+      <w:r>
+        <w:rPr>
+          <w:rFonts w:ascii="MS Gothic" w:eastAsia="MS Gothic" w:hAnsi="MS Gothic" w:cs="MS Gothic"/>
+        </w:rPr>
+        <w:t>├</w:t>
+      </w:r>
+      <w:r>
+        <w:t>── GameManager.cpp</w:t>
+      </w:r>
+    </w:p>
+    <w:p>
+      <w:pPr>
+        <w:spacing w:after="0"/>
+      </w:pPr>
+      <w:r>
+        <w:t xml:space="preserve">│   </w:t>
+      </w:r>
+      <w:r>
+        <w:rPr>
+          <w:rFonts w:ascii="MS Gothic" w:eastAsia="MS Gothic" w:hAnsi="MS Gothic" w:cs="MS Gothic"/>
+        </w:rPr>
+        <w:t>├</w:t>
+      </w:r>
+      <w:r>
+        <w:t>── GameManager.h</w:t>
+      </w:r>
+    </w:p>
+    <w:p>
+      <w:pPr>
+        <w:spacing w:after="0"/>
+      </w:pPr>
+      <w:r>
+        <w:t xml:space="preserve">│   </w:t>
+      </w:r>
+      <w:r>
+        <w:rPr>
+          <w:rFonts w:ascii="MS Gothic" w:eastAsia="MS Gothic" w:hAnsi="MS Gothic" w:cs="MS Gothic"/>
+        </w:rPr>
+        <w:t>├</w:t>
+      </w:r>
+      <w:r>
+        <w:t>── Level.h</w:t>
+      </w:r>
+    </w:p>
+    <w:p>
+      <w:pPr>
+        <w:spacing w:after="0"/>
+      </w:pPr>
+      <w:r>
+        <w:t xml:space="preserve">│   </w:t>
+      </w:r>
+      <w:r>
+        <w:rPr>
+          <w:rFonts w:ascii="MS Gothic" w:eastAsia="MS Gothic" w:hAnsi="MS Gothic" w:cs="MS Gothic"/>
+        </w:rPr>
+        <w:t>├</w:t>
+      </w:r>
+      <w:r>
+        <w:t>── PhysicsManager.h</w:t>
+      </w:r>
+    </w:p>
+    <w:p>
+      <w:pPr>
+        <w:spacing w:after="0"/>
+      </w:pPr>
+      <w:r>
+        <w:t>│   └── main.cpp</w:t>
+      </w:r>
+    </w:p>
+    <w:p>
+      <w:pPr>
+        <w:spacing w:after="0"/>
+      </w:pPr>
+      <w:r>
+        <w:rPr>
+          <w:rFonts w:ascii="MS Gothic" w:eastAsia="MS Gothic" w:hAnsi="MS Gothic" w:cs="MS Gothic"/>
+        </w:rPr>
+        <w:t>├</w:t>
+      </w:r>
+      <w:r>
+        <w:t>── tests/</w:t>
+      </w:r>
+    </w:p>
+    <w:p>
+      <w:pPr>
+        <w:spacing w:after="0"/>
+      </w:pPr>
+      <w:r>
+        <w:t xml:space="preserve">│   </w:t>
+      </w:r>
+      <w:r>
+        <w:rPr>
+          <w:rFonts w:ascii="MS Gothic" w:eastAsia="MS Gothic" w:hAnsi="MS Gothic" w:cs="MS Gothic"/>
+        </w:rPr>
+        <w:t>├</w:t>
+      </w:r>
+      <w:r>
+        <w:t xml:space="preserve">── </w:t>
       </w:r>
       <w:proofErr w:type="spellStart"/>
       <w:r>
-        <w:t>GameConstants.h</w:t>
+        <w:t>TestHarness.h</w:t>
       </w:r>
       <w:proofErr w:type="spellEnd"/>
-      <w:r>
-        <w:t>`, `</w:t>
-      </w:r>
-      <w:proofErr w:type="spellStart"/>
-      <w:r>
-        <w:t>GameHelpers.h</w:t>
-      </w:r>
-      <w:proofErr w:type="spellEnd"/>
-      <w:r>
-        <w:t>`, `</w:t>
-      </w:r>
-      <w:proofErr w:type="spellStart"/>
-      <w:r>
-        <w:t>src</w:t>
-      </w:r>
-      <w:proofErr w:type="spellEnd"/>
-      <w:r>
-        <w:t>/</w:t>
-      </w:r>
-      <w:proofErr w:type="spellStart"/>
-      <w:r>
-        <w:t>GameManager.h</w:t>
-      </w:r>
-      <w:proofErr w:type="spellEnd"/>
-      <w:r>
-        <w:t>`, `</w:t>
-      </w:r>
-      <w:proofErr w:type="spellStart"/>
-      <w:r>
-        <w:t>src</w:t>
-      </w:r>
-      <w:proofErr w:type="spellEnd"/>
-      <w:r>
-        <w:t>/GameManager.cpp`, and `</w:t>
-      </w:r>
-      <w:proofErr w:type="spellStart"/>
-      <w:r>
-        <w:t>src</w:t>
-      </w:r>
-      <w:proofErr w:type="spellEnd"/>
-      <w:r>
-        <w:t>/</w:t>
-      </w:r>
-      <w:proofErr w:type="spellStart"/>
-      <w:r>
-        <w:t>PhysicsManager.h</w:t>
-      </w:r>
-      <w:proofErr w:type="spellEnd"/>
-      <w:r>
-        <w:t>`. Supporting assets are stored in `assets/`, project documentation is stored in `docs/`, and automated tests now live in `tests/`.</w:t>
-      </w:r>
-    </w:p>
-    <w:p>
-      <w:proofErr w:type="spellStart"/>
-      <w:r>
-        <w:t>BreakoutGame</w:t>
-      </w:r>
-      <w:proofErr w:type="spellEnd"/>
-      <w:r>
-        <w:t>/</w:t>
-      </w:r>
-    </w:p>
-    <w:p>
+    </w:p>
+    <w:p>
+      <w:pPr>
+        <w:spacing w:after="0"/>
+      </w:pPr>
+      <w:r>
+        <w:t xml:space="preserve">│   </w:t>
+      </w:r>
       <w:r>
         <w:rPr>
           <w:rFonts w:ascii="MS Gothic" w:eastAsia="MS Gothic" w:hAnsi="MS Gothic" w:cs="MS Gothic"/>
@@ -1945,23 +2162,16 @@
         <w:t>├</w:t>
       </w:r>
       <w:r>
-        <w:t>─</w:t>
-      </w:r>
-      <w:proofErr w:type="gramStart"/>
-      <w:r>
-        <w:t>─ .</w:t>
-      </w:r>
-      <w:proofErr w:type="spellStart"/>
-      <w:r>
-        <w:t>vscode</w:t>
-      </w:r>
-      <w:proofErr w:type="spellEnd"/>
-      <w:proofErr w:type="gramEnd"/>
-      <w:r>
-        <w:t>/</w:t>
-      </w:r>
-    </w:p>
-    <w:p>
+        <w:t>── TestMain.cpp</w:t>
+      </w:r>
+    </w:p>
+    <w:p>
+      <w:pPr>
+        <w:spacing w:after="0"/>
+      </w:pPr>
+      <w:r>
+        <w:t xml:space="preserve">│   </w:t>
+      </w:r>
       <w:r>
         <w:rPr>
           <w:rFonts w:ascii="MS Gothic" w:eastAsia="MS Gothic" w:hAnsi="MS Gothic" w:cs="MS Gothic"/>
@@ -1969,15 +2179,16 @@
         <w:t>├</w:t>
       </w:r>
       <w:r>
-        <w:t>── assets/</w:t>
-      </w:r>
-    </w:p>
-    <w:p>
-      <w:r>
-        <w:t>│   └── fonts/</w:t>
-      </w:r>
-    </w:p>
-    <w:p>
+        <w:t>── GameHelpersTests.cpp</w:t>
+      </w:r>
+    </w:p>
+    <w:p>
+      <w:pPr>
+        <w:spacing w:after="0"/>
+      </w:pPr>
+      <w:r>
+        <w:t xml:space="preserve">│   </w:t>
+      </w:r>
       <w:r>
         <w:rPr>
           <w:rFonts w:ascii="MS Gothic" w:eastAsia="MS Gothic" w:hAnsi="MS Gothic" w:cs="MS Gothic"/>
@@ -1985,13 +2196,21 @@
         <w:t>├</w:t>
       </w:r>
       <w:r>
-        <w:t>── docs/</w:t>
-      </w:r>
-    </w:p>
-    <w:p>
-      <w:r>
-        <w:t xml:space="preserve">│   </w:t>
-      </w:r>
+        <w:t>── GameManagerTests.cpp</w:t>
+      </w:r>
+    </w:p>
+    <w:p>
+      <w:pPr>
+        <w:spacing w:after="0"/>
+      </w:pPr>
+      <w:r>
+        <w:t>│   └── PhysicsManagerTests.cpp</w:t>
+      </w:r>
+    </w:p>
+    <w:p>
+      <w:pPr>
+        <w:spacing w:after="0"/>
+      </w:pPr>
       <w:r>
         <w:rPr>
           <w:rFonts w:ascii="MS Gothic" w:eastAsia="MS Gothic" w:hAnsi="MS Gothic" w:cs="MS Gothic"/>
@@ -1999,14 +2218,13 @@
         <w:t>├</w:t>
       </w:r>
       <w:r>
-        <w:t>── 00_master/</w:t>
-      </w:r>
-    </w:p>
-    <w:p>
-      <w:r>
-        <w:lastRenderedPageBreak/>
-        <w:t xml:space="preserve">│   </w:t>
-      </w:r>
+        <w:t>── Game.cpp</w:t>
+      </w:r>
+    </w:p>
+    <w:p>
+      <w:pPr>
+        <w:spacing w:after="0"/>
+      </w:pPr>
       <w:r>
         <w:rPr>
           <w:rFonts w:ascii="MS Gothic" w:eastAsia="MS Gothic" w:hAnsi="MS Gothic" w:cs="MS Gothic"/>
@@ -2014,18 +2232,13 @@
         <w:t>├</w:t>
       </w:r>
       <w:r>
-        <w:t>── 01_features/</w:t>
-      </w:r>
-    </w:p>
-    <w:p>
-      <w:r>
-        <w:t>│   └── 02_management/</w:t>
-      </w:r>
-    </w:p>
-    <w:p>
-      <w:r>
-        <w:t xml:space="preserve">│       </w:t>
-      </w:r>
+        <w:t>── Game.h</w:t>
+      </w:r>
+    </w:p>
+    <w:p>
+      <w:pPr>
+        <w:spacing w:after="0"/>
+      </w:pPr>
       <w:r>
         <w:rPr>
           <w:rFonts w:ascii="MS Gothic" w:eastAsia="MS Gothic" w:hAnsi="MS Gothic" w:cs="MS Gothic"/>
@@ -2033,13 +2246,13 @@
         <w:t>├</w:t>
       </w:r>
       <w:r>
-        <w:t>── Phase1_Source_Summary.md</w:t>
-      </w:r>
-    </w:p>
-    <w:p>
-      <w:r>
-        <w:t xml:space="preserve">│       </w:t>
-      </w:r>
+        <w:t>── GameConstants.h</w:t>
+      </w:r>
+    </w:p>
+    <w:p>
+      <w:pPr>
+        <w:spacing w:after="0"/>
+      </w:pPr>
       <w:r>
         <w:rPr>
           <w:rFonts w:ascii="MS Gothic" w:eastAsia="MS Gothic" w:hAnsi="MS Gothic" w:cs="MS Gothic"/>
@@ -2047,15 +2260,13 @@
         <w:t>├</w:t>
       </w:r>
       <w:r>
-        <w:t>── Phase1_Test_Checklist.md</w:t>
-      </w:r>
-    </w:p>
-    <w:p>
-      <w:r>
-        <w:t>│       └── unit_test_cases.md</w:t>
-      </w:r>
-    </w:p>
-    <w:p>
+        <w:t>── GameHelpers.h</w:t>
+      </w:r>
+    </w:p>
+    <w:p>
+      <w:pPr>
+        <w:spacing w:after="0"/>
+      </w:pPr>
       <w:r>
         <w:rPr>
           <w:rFonts w:ascii="MS Gothic" w:eastAsia="MS Gothic" w:hAnsi="MS Gothic" w:cs="MS Gothic"/>
@@ -2063,13 +2274,13 @@
         <w:t>├</w:t>
       </w:r>
       <w:r>
-        <w:t>── scripts/</w:t>
-      </w:r>
-    </w:p>
-    <w:p>
-      <w:r>
-        <w:t xml:space="preserve">│   </w:t>
-      </w:r>
+        <w:t>── phase1_main.cpp</w:t>
+      </w:r>
+    </w:p>
+    <w:p>
+      <w:pPr>
+        <w:spacing w:after="0"/>
+      </w:pPr>
       <w:r>
         <w:rPr>
           <w:rFonts w:ascii="MS Gothic" w:eastAsia="MS Gothic" w:hAnsi="MS Gothic" w:cs="MS Gothic"/>
@@ -2077,13 +2288,13 @@
         <w:t>├</w:t>
       </w:r>
       <w:r>
-        <w:t>── Resolve-Toolchain.ps1</w:t>
-      </w:r>
-    </w:p>
-    <w:p>
-      <w:r>
-        <w:t xml:space="preserve">│   </w:t>
-      </w:r>
+        <w:t>── CMakeLists.txt</w:t>
+      </w:r>
+    </w:p>
+    <w:p>
+      <w:pPr>
+        <w:spacing w:after="0"/>
+      </w:pPr>
       <w:r>
         <w:rPr>
           <w:rFonts w:ascii="MS Gothic" w:eastAsia="MS Gothic" w:hAnsi="MS Gothic" w:cs="MS Gothic"/>
@@ -2091,318 +2302,13 @@
         <w:t>├</w:t>
       </w:r>
       <w:r>
-        <w:t>── build-phase1.ps1</w:t>
-      </w:r>
-    </w:p>
-    <w:p>
-      <w:r>
-        <w:t>│   └── run-game.ps1</w:t>
-      </w:r>
-    </w:p>
-    <w:p>
-      <w:r>
-        <w:rPr>
-          <w:rFonts w:ascii="MS Gothic" w:eastAsia="MS Gothic" w:hAnsi="MS Gothic" w:cs="MS Gothic"/>
-        </w:rPr>
-        <w:t>├</w:t>
-      </w:r>
-      <w:r>
-        <w:t xml:space="preserve">── </w:t>
-      </w:r>
-      <w:proofErr w:type="spellStart"/>
-      <w:r>
-        <w:t>src</w:t>
-      </w:r>
-      <w:proofErr w:type="spellEnd"/>
-      <w:r>
-        <w:t>/</w:t>
-      </w:r>
-    </w:p>
-    <w:p>
-      <w:r>
-        <w:t xml:space="preserve">│   </w:t>
-      </w:r>
-      <w:r>
-        <w:rPr>
-          <w:rFonts w:ascii="MS Gothic" w:eastAsia="MS Gothic" w:hAnsi="MS Gothic" w:cs="MS Gothic"/>
-        </w:rPr>
-        <w:t>├</w:t>
-      </w:r>
-      <w:r>
-        <w:t>── Block.cpp</w:t>
-      </w:r>
-    </w:p>
-    <w:p>
-      <w:r>
-        <w:t xml:space="preserve">│   </w:t>
-      </w:r>
-      <w:r>
-        <w:rPr>
-          <w:rFonts w:ascii="MS Gothic" w:eastAsia="MS Gothic" w:hAnsi="MS Gothic" w:cs="MS Gothic"/>
-        </w:rPr>
-        <w:t>├</w:t>
-      </w:r>
-      <w:r>
-        <w:t xml:space="preserve">── </w:t>
-      </w:r>
-      <w:proofErr w:type="spellStart"/>
-      <w:r>
-        <w:t>Block.h</w:t>
-      </w:r>
-      <w:proofErr w:type="spellEnd"/>
-    </w:p>
-    <w:p>
-      <w:r>
-        <w:t xml:space="preserve">│   </w:t>
-      </w:r>
-      <w:r>
-        <w:rPr>
-          <w:rFonts w:ascii="MS Gothic" w:eastAsia="MS Gothic" w:hAnsi="MS Gothic" w:cs="MS Gothic"/>
-        </w:rPr>
-        <w:t>├</w:t>
-      </w:r>
-      <w:r>
-        <w:t>── GameManager.cpp</w:t>
-      </w:r>
-    </w:p>
-    <w:p>
-      <w:r>
-        <w:t xml:space="preserve">│   </w:t>
-      </w:r>
-      <w:r>
-        <w:rPr>
-          <w:rFonts w:ascii="MS Gothic" w:eastAsia="MS Gothic" w:hAnsi="MS Gothic" w:cs="MS Gothic"/>
-        </w:rPr>
-        <w:t>├</w:t>
-      </w:r>
-      <w:r>
-        <w:t xml:space="preserve">── </w:t>
-      </w:r>
-      <w:proofErr w:type="spellStart"/>
-      <w:r>
-        <w:t>GameManager.h</w:t>
-      </w:r>
-      <w:proofErr w:type="spellEnd"/>
-    </w:p>
-    <w:p>
-      <w:r>
-        <w:t xml:space="preserve">│   </w:t>
-      </w:r>
-      <w:r>
-        <w:rPr>
-          <w:rFonts w:ascii="MS Gothic" w:eastAsia="MS Gothic" w:hAnsi="MS Gothic" w:cs="MS Gothic"/>
-        </w:rPr>
-        <w:t>├</w:t>
-      </w:r>
-      <w:r>
-        <w:t xml:space="preserve">── </w:t>
-      </w:r>
-      <w:proofErr w:type="spellStart"/>
-      <w:r>
-        <w:t>Level.h</w:t>
-      </w:r>
-      <w:proofErr w:type="spellEnd"/>
-    </w:p>
-    <w:p>
-      <w:r>
-        <w:t xml:space="preserve">│   </w:t>
-      </w:r>
-      <w:r>
-        <w:rPr>
-          <w:rFonts w:ascii="MS Gothic" w:eastAsia="MS Gothic" w:hAnsi="MS Gothic" w:cs="MS Gothic"/>
-        </w:rPr>
-        <w:t>├</w:t>
-      </w:r>
-      <w:r>
-        <w:t xml:space="preserve">── </w:t>
-      </w:r>
-      <w:proofErr w:type="spellStart"/>
-      <w:r>
-        <w:t>PhysicsManager.h</w:t>
-      </w:r>
-      <w:proofErr w:type="spellEnd"/>
-    </w:p>
-    <w:p>
-      <w:r>
-        <w:t>│   └── main.cpp</w:t>
-      </w:r>
-    </w:p>
-    <w:p>
-      <w:r>
-        <w:rPr>
-          <w:rFonts w:ascii="MS Gothic" w:eastAsia="MS Gothic" w:hAnsi="MS Gothic" w:cs="MS Gothic"/>
-        </w:rPr>
-        <w:t>├</w:t>
-      </w:r>
-      <w:r>
-        <w:t>── tests/</w:t>
-      </w:r>
-    </w:p>
-    <w:p>
-      <w:r>
-        <w:t xml:space="preserve">│   </w:t>
-      </w:r>
-      <w:r>
-        <w:rPr>
-          <w:rFonts w:ascii="MS Gothic" w:eastAsia="MS Gothic" w:hAnsi="MS Gothic" w:cs="MS Gothic"/>
-        </w:rPr>
-        <w:t>├</w:t>
-      </w:r>
-      <w:r>
-        <w:t xml:space="preserve">── </w:t>
-      </w:r>
-      <w:proofErr w:type="spellStart"/>
-      <w:r>
-        <w:t>TestHarness.h</w:t>
-      </w:r>
-      <w:proofErr w:type="spellEnd"/>
-    </w:p>
-    <w:p>
-      <w:r>
-        <w:t xml:space="preserve">│   </w:t>
-      </w:r>
-      <w:r>
-        <w:rPr>
-          <w:rFonts w:ascii="MS Gothic" w:eastAsia="MS Gothic" w:hAnsi="MS Gothic" w:cs="MS Gothic"/>
-        </w:rPr>
-        <w:t>├</w:t>
-      </w:r>
-      <w:r>
-        <w:t>── TestMain.cpp</w:t>
-      </w:r>
-    </w:p>
-    <w:p>
-      <w:r>
-        <w:t xml:space="preserve">│   </w:t>
-      </w:r>
-      <w:r>
-        <w:rPr>
-          <w:rFonts w:ascii="MS Gothic" w:eastAsia="MS Gothic" w:hAnsi="MS Gothic" w:cs="MS Gothic"/>
-        </w:rPr>
-        <w:t>├</w:t>
-      </w:r>
-      <w:r>
-        <w:t>── GameHelpersTests.cpp</w:t>
-      </w:r>
-    </w:p>
-    <w:p>
-      <w:r>
-        <w:t xml:space="preserve">│   </w:t>
-      </w:r>
-      <w:r>
-        <w:rPr>
-          <w:rFonts w:ascii="MS Gothic" w:eastAsia="MS Gothic" w:hAnsi="MS Gothic" w:cs="MS Gothic"/>
-        </w:rPr>
-        <w:t>├</w:t>
-      </w:r>
-      <w:r>
-        <w:t>── GameManagerTests.cpp</w:t>
-      </w:r>
-    </w:p>
-    <w:p>
-      <w:r>
-        <w:t>│   └── PhysicsManagerTests.cpp</w:t>
-      </w:r>
-    </w:p>
-    <w:p>
-      <w:r>
-        <w:rPr>
-          <w:rFonts w:ascii="MS Gothic" w:eastAsia="MS Gothic" w:hAnsi="MS Gothic" w:cs="MS Gothic"/>
-        </w:rPr>
-        <w:t>├</w:t>
-      </w:r>
-      <w:r>
-        <w:t>── Game.cpp</w:t>
-      </w:r>
-    </w:p>
-    <w:p>
-      <w:r>
-        <w:rPr>
-          <w:rFonts w:ascii="MS Gothic" w:eastAsia="MS Gothic" w:hAnsi="MS Gothic" w:cs="MS Gothic"/>
-        </w:rPr>
-        <w:t>├</w:t>
-      </w:r>
-      <w:r>
-        <w:t xml:space="preserve">── </w:t>
-      </w:r>
-      <w:proofErr w:type="spellStart"/>
-      <w:r>
-        <w:t>Game.h</w:t>
-      </w:r>
-      <w:proofErr w:type="spellEnd"/>
-    </w:p>
-    <w:p>
-      <w:r>
-        <w:rPr>
-          <w:rFonts w:ascii="MS Gothic" w:eastAsia="MS Gothic" w:hAnsi="MS Gothic" w:cs="MS Gothic"/>
-        </w:rPr>
-        <w:t>├</w:t>
-      </w:r>
-      <w:r>
-        <w:t xml:space="preserve">── </w:t>
-      </w:r>
-      <w:proofErr w:type="spellStart"/>
-      <w:r>
-        <w:t>GameConstants.h</w:t>
-      </w:r>
-      <w:proofErr w:type="spellEnd"/>
-    </w:p>
-    <w:p>
-      <w:r>
-        <w:rPr>
-          <w:rFonts w:ascii="MS Gothic" w:eastAsia="MS Gothic" w:hAnsi="MS Gothic" w:cs="MS Gothic"/>
-        </w:rPr>
-        <w:lastRenderedPageBreak/>
-        <w:t>├</w:t>
-      </w:r>
-      <w:r>
-        <w:t xml:space="preserve">── </w:t>
-      </w:r>
-      <w:proofErr w:type="spellStart"/>
-      <w:r>
-        <w:t>GameHelpers.h</w:t>
-      </w:r>
-      <w:proofErr w:type="spellEnd"/>
-    </w:p>
-    <w:p>
-      <w:r>
-        <w:rPr>
-          <w:rFonts w:ascii="MS Gothic" w:eastAsia="MS Gothic" w:hAnsi="MS Gothic" w:cs="MS Gothic"/>
-        </w:rPr>
-        <w:t>├</w:t>
-      </w:r>
-      <w:r>
-        <w:t>── phase1_main.cpp</w:t>
-      </w:r>
-    </w:p>
-    <w:p>
-      <w:r>
-        <w:rPr>
-          <w:rFonts w:ascii="MS Gothic" w:eastAsia="MS Gothic" w:hAnsi="MS Gothic" w:cs="MS Gothic"/>
-        </w:rPr>
-        <w:t>├</w:t>
-      </w:r>
-      <w:r>
-        <w:t>── CMakeLists.txt</w:t>
-      </w:r>
-    </w:p>
-    <w:p>
-      <w:r>
-        <w:rPr>
-          <w:rFonts w:ascii="MS Gothic" w:eastAsia="MS Gothic" w:hAnsi="MS Gothic" w:cs="MS Gothic"/>
-        </w:rPr>
-        <w:t>├</w:t>
-      </w:r>
-      <w:r>
-        <w:t xml:space="preserve">── </w:t>
-      </w:r>
-      <w:proofErr w:type="spellStart"/>
-      <w:r>
-        <w:t>CMakePresets.json</w:t>
-      </w:r>
-      <w:proofErr w:type="spellEnd"/>
-    </w:p>
-    <w:p>
+        <w:t>── CMakePresets.json</w:t>
+      </w:r>
+    </w:p>
+    <w:p>
+      <w:pPr>
+        <w:spacing w:after="0"/>
+      </w:pPr>
       <w:r>
         <w:t>└── README.md</w:t>
       </w:r>
@@ -2415,23 +2321,7 @@
         </w:rPr>
       </w:pPr>
       <w:r>
-        <w:t>The repository also still contains an earlier prototype under `</w:t>
-      </w:r>
-      <w:proofErr w:type="spellStart"/>
-      <w:r>
-        <w:t>src</w:t>
-      </w:r>
-      <w:proofErr w:type="spellEnd"/>
-      <w:r>
-        <w:t>/main.cpp` and related `</w:t>
-      </w:r>
-      <w:proofErr w:type="spellStart"/>
-      <w:r>
-        <w:t>src</w:t>
-      </w:r>
-      <w:proofErr w:type="spellEnd"/>
-      <w:r>
-        <w:t xml:space="preserve">/` files. That prototype is retained for reference, but it is not the primary submission target. The graded gameplay executable remains `main.exe` built from the repository root sources. </w:t>
+        <w:t xml:space="preserve">The repository also still contains an earlier prototype under `src/main.cpp` and related `src/` files. That prototype is retained for reference, but it is not the primary submission target. The graded gameplay executable remains `main.exe` built from the repository root sources. </w:t>
       </w:r>
       <w:proofErr w:type="spellStart"/>
       <w:r>
@@ -2476,11 +2366,11 @@
       </w:r>
       <w:proofErr w:type="gramStart"/>
       <w:r>
-        <w:t>Game::run(</w:t>
+        <w:t>Game::</w:t>
       </w:r>
       <w:proofErr w:type="gramEnd"/>
       <w:r>
-        <w:t>). The loop clamps frame delta time, handles events, processes keyboard shortcuts, updates gameplay state, renders the active screen, and presents the frame. This provides a stable real-time execution cycle for gameplay, menu flow, and settings navigation.</w:t>
+        <w:t>run(). The loop clamps frame delta time, handles events, processes keyboard shortcuts, updates gameplay state, renders the active screen, and presents the frame. This provides a stable real-time execution cycle for gameplay, menu flow, and settings navigation.</w:t>
       </w:r>
     </w:p>
     <w:p>
@@ -2501,6 +2391,7 @@
         <w:spacing w:after="40"/>
       </w:pPr>
       <w:r>
+        <w:lastRenderedPageBreak/>
         <w:t>The paddle is controlled with Left Arrow / Right Arrow and A / D. Movement is restricted to the playable horizontal area through clamping logic so the paddle cannot leave the game field. Menu screens use keyboard navigation, and the main menu also supports mouse-click selection.</w:t>
       </w:r>
     </w:p>
@@ -2609,11 +2500,46 @@
         <w:spacing w:after="40"/>
       </w:pPr>
       <w:r>
-        <w:t xml:space="preserve">The game tracks score, lives, screen state, and match outcome. Lives decrement when the ball falls below the paddle, but they never drop below zero. The game enters a win state when all bricks are cleared and a game-over state when lives are exhausted. HUD text shows score and lives during play and displays terminal-state messaging at win or loss. Restart support resets score, lives, bricks, paddle </w:t>
-      </w:r>
-      <w:r>
-        <w:lastRenderedPageBreak/>
-        <w:t>position, and ball state. The game also supports returning to the main menu from active or terminal states.</w:t>
+        <w:t>The game tracks score, lives, screen state, and match outcome. Lives decrement when the ball falls below the paddle, but they never drop below zero. The game enters a win state when all bricks are cleared and a game-over state when lives are exhausted. HUD text shows score and lives during play and displays terminal-state messaging at win or loss. Restart support resets score, lives, bricks, paddle position, and ball state. The game also supports returning to the main menu from active or terminal states.</w:t>
+      </w:r>
+    </w:p>
+    <w:p>
+      <w:pPr>
+        <w:spacing w:after="40"/>
+      </w:pPr>
+      <w:r>
+        <w:rPr>
+          <w:b/>
+          <w:bCs/>
+          <w:color w:val="1F1F1F"/>
+        </w:rPr>
+        <w:t>Sound Effects</w:t>
+      </w:r>
+    </w:p>
+    <w:p>
+      <w:pPr>
+        <w:spacing w:after="40"/>
+      </w:pPr>
+      <w:r>
+        <w:t>When the game starts, music will be loaded and started</w:t>
+      </w:r>
+      <w:r>
+        <w:t>. The music will loop and restart once it ends</w:t>
+      </w:r>
+      <w:r>
+        <w:t>. Have the ability to change the volume</w:t>
+      </w:r>
+      <w:r>
+        <w:t xml:space="preserve"> of the music in the settings. </w:t>
+      </w:r>
+      <w:r>
+        <w:t>When certain events happen, sounds will play. Currently the only events that will play sound are clickin</w:t>
+      </w:r>
+      <w:r>
+        <w:t xml:space="preserve">g buttons. There is code implemented for when the ball hits the paddle/walls, and when the ball hits bricks, with that is needed being the sound files themselves. </w:t>
+      </w:r>
+      <w:r>
+        <w:t xml:space="preserve"> </w:t>
       </w:r>
     </w:p>
     <w:p>
@@ -2766,15 +2692,7 @@
             </w:r>
             <w:proofErr w:type="spellEnd"/>
             <w:r>
-              <w:t>. Functions and variables use camelCase or lower camel case, and shared constants are centralized in </w:t>
-            </w:r>
-            <w:proofErr w:type="spellStart"/>
-            <w:r>
-              <w:t>GameConstants.h</w:t>
-            </w:r>
-            <w:proofErr w:type="spellEnd"/>
-            <w:r>
-              <w:t>.</w:t>
+              <w:t>. Functions and variables use camelCase or lower camel case, and shared constants are centralized in GameConstants.h.</w:t>
             </w:r>
           </w:p>
         </w:tc>
@@ -2796,6 +2714,7 @@
           </w:tcPr>
           <w:p>
             <w:r>
+              <w:lastRenderedPageBreak/>
               <w:t>Commenting approach</w:t>
             </w:r>
           </w:p>
@@ -3119,11 +3038,7 @@
           </w:tcPr>
           <w:p>
             <w:r>
-              <w:t xml:space="preserve">Run `.\scripts\build-phase1.ps1` from the repository root and confirm that `main.exe` is </w:t>
-            </w:r>
-            <w:r>
-              <w:lastRenderedPageBreak/>
-              <w:t>produced without compiler or linker errors.</w:t>
+              <w:t>Run `.\scripts\build-phase1.ps1` from the repository root and confirm that `main.exe` is produced without compiler or linker errors.</w:t>
             </w:r>
           </w:p>
         </w:tc>
@@ -3142,7 +3057,6 @@
               <w:jc w:val="center"/>
             </w:pPr>
             <w:r>
-              <w:lastRenderedPageBreak/>
               <w:t>[</w:t>
             </w:r>
             <w:r>
@@ -3299,6 +3213,7 @@
           </w:tcPr>
           <w:p>
             <w:r>
+              <w:lastRenderedPageBreak/>
               <w:t>Manual gameplay regression</w:t>
             </w:r>
           </w:p>
@@ -3603,11 +3518,7 @@
       </w:r>
       <w:proofErr w:type="spellEnd"/>
       <w:r>
-        <w:t xml:space="preserve"> preset workflow, addition of automated </w:t>
-      </w:r>
-      <w:r>
-        <w:lastRenderedPageBreak/>
-        <w:t>unit tests for deterministic helper/state modules, consolidation of manual gameplay evidence into `docs/02_management/Phase1_Test_Checklist.md`, and documentation updates aligning the README, source summary, unit test cases, and final source code report with the current repository state.</w:t>
+        <w:t xml:space="preserve"> preset workflow, addition of automated unit tests for deterministic helper/state modules, consolidation of manual gameplay evidence into `docs/02_management/Phase1_Test_Checklist.md`, and documentation updates aligning the README, source summary, unit test cases, and final source code report with the current repository state.</w:t>
       </w:r>
     </w:p>
     <w:p>
@@ -3673,6 +3584,7 @@
                 <w:bCs/>
                 <w:color w:val="FFFFFF"/>
               </w:rPr>
+              <w:lastRenderedPageBreak/>
               <w:t>Issue / Risk</w:t>
             </w:r>
           </w:p>
@@ -3888,15 +3800,7 @@
           </w:tcPr>
           <w:p>
             <w:r>
-              <w:t>The repository still contains both the active root gameplay executable and an earlier prototype under `</w:t>
-            </w:r>
-            <w:proofErr w:type="spellStart"/>
-            <w:r>
-              <w:t>src</w:t>
-            </w:r>
-            <w:proofErr w:type="spellEnd"/>
-            <w:r>
-              <w:t>/`, which can confuse reviewers if undocumented.</w:t>
+              <w:t>The repository still contains both the active root gameplay executable and an earlier prototype under `src/`, which can confuse reviewers if undocumented.</w:t>
             </w:r>
           </w:p>
         </w:tc>
@@ -3916,15 +3820,7 @@
           </w:tcPr>
           <w:p>
             <w:r>
-              <w:t>Keep the README and report explicit that the root-level gameplay path is the graded submission target and that the older `</w:t>
-            </w:r>
-            <w:proofErr w:type="spellStart"/>
-            <w:r>
-              <w:t>src</w:t>
-            </w:r>
-            <w:proofErr w:type="spellEnd"/>
-            <w:r>
-              <w:t>/` prototype is secondary reference code.</w:t>
+              <w:t>Keep the README and report explicit that the root-level gameplay path is the graded submission target and that the older `src/` prototype is secondary reference code.</w:t>
             </w:r>
           </w:p>
         </w:tc>
@@ -4005,7 +3901,6 @@
           <w:b/>
           <w:bCs/>
         </w:rPr>
-        <w:lastRenderedPageBreak/>
         <w:t>Note:</w:t>
       </w:r>
       <w:r>
@@ -4075,6 +3970,7 @@
                 <w:bCs/>
                 <w:color w:val="FFFFFF"/>
               </w:rPr>
+              <w:lastRenderedPageBreak/>
               <w:t>Team Member</w:t>
             </w:r>
           </w:p>
@@ -4203,13 +4099,8 @@
           </w:tcPr>
           <w:p>
             <w:r>
-              <w:t xml:space="preserve">Ethan </w:t>
-            </w:r>
-            <w:proofErr w:type="spellStart"/>
-            <w:r>
-              <w:t>Wasniak</w:t>
-            </w:r>
-            <w:proofErr w:type="spellEnd"/>
+              <w:t>Ethan Wasniak</w:t>
+            </w:r>
           </w:p>
         </w:tc>
         <w:tc>
@@ -4240,7 +4131,38 @@
             </w:tcMar>
             <w:vAlign w:val="center"/>
           </w:tcPr>
-          <w:p/>
+          <w:p>
+            <w:r>
+              <w:t>Implemented mouse click res</w:t>
+            </w:r>
+            <w:r>
+              <w:t>p</w:t>
+            </w:r>
+            <w:r>
+              <w:t>onse and tracking on the m</w:t>
+            </w:r>
+            <w:r>
+              <w:t xml:space="preserve">ain page and settings page. Added music </w:t>
+            </w:r>
+            <w:r>
+              <w:t xml:space="preserve">and button click sound </w:t>
+            </w:r>
+            <w:r>
+              <w:t>effects and</w:t>
+            </w:r>
+            <w:r>
+              <w:t xml:space="preserve"> </w:t>
+            </w:r>
+            <w:r>
+              <w:t xml:space="preserve">implemented other audio causing events missing only a sound file. Compiled and contributed to a list of future features </w:t>
+            </w:r>
+            <w:r>
+              <w:t>to be possibly implemented.</w:t>
+            </w:r>
+            <w:r>
+              <w:t xml:space="preserve"> </w:t>
+            </w:r>
+          </w:p>
         </w:tc>
       </w:tr>
       <w:tr>
@@ -4292,7 +4214,20 @@
             </w:tcMar>
             <w:vAlign w:val="center"/>
           </w:tcPr>
-          <w:p/>
+          <w:p>
+            <w:r>
+              <w:rPr>
+                <w:color w:val="000000"/>
+              </w:rPr>
+              <w:t>I focused on input handling to ensure smooth, responsive gameplay. This involved developing core input logic, improving control consistency, and supporting integration with overall game mechanics. In addition, I contributed to expanding gameplay features by assisting with the implementation of different brick types and enhancing collision effects to create more dynamic and engaging interactions</w:t>
+            </w:r>
+            <w:r>
+              <w:rPr>
+                <w:color w:val="000000"/>
+              </w:rPr>
+              <w:t>.</w:t>
+            </w:r>
+          </w:p>
         </w:tc>
       </w:tr>
       <w:tr>
@@ -4362,7 +4297,11 @@
               <w:t>GUI/menu coordination, milestone tracking</w:t>
             </w:r>
             <w:r>
-              <w:t xml:space="preserve"> Reviewed repository structure and documentation consistency, coordinated milestone tracking and rubric compliance, validated GUI integration with physics and input systems, tested full gameplay flow (menu → play → end), verified scoring and brick destruction logic, stress</w:t>
+              <w:t xml:space="preserve"> Reviewed repository structure and documentation consistency, coordinated milestone tracking and rubric compliance, validated GUI </w:t>
+            </w:r>
+            <w:r>
+              <w:lastRenderedPageBreak/>
+              <w:t>integration with physics and input systems, tested full gameplay flow (menu → play → end), verified scoring and brick destruction logic, stress</w:t>
             </w:r>
             <w:r>
               <w:noBreakHyphen/>
@@ -4392,6 +4331,7 @@
           </w:tcPr>
           <w:p>
             <w:r>
+              <w:lastRenderedPageBreak/>
               <w:t>Steven Dickinson</w:t>
             </w:r>
           </w:p>
@@ -4434,11 +4374,7 @@
           </w:tcPr>
           <w:p>
             <w:r>
-              <w:t xml:space="preserve">Maintained and finalized the submission documentation set, updated the README and source </w:t>
-            </w:r>
-            <w:r>
-              <w:lastRenderedPageBreak/>
-              <w:t xml:space="preserve">summary to match the current repository, consolidated the manual gameplay evidence into `docs/02_management/Phase1_Test_Checklist.md`, documented automated unit tests in `docs/02_management/unit_test_cases.md`, reviewed the source code report against the live repository, and verified the final build/test workflow including </w:t>
+              <w:t xml:space="preserve">Maintained and finalized the submission documentation set, updated the README and source summary to match the current repository, consolidated the manual gameplay evidence into `docs/02_management/Phase1_Test_Checklist.md`, documented automated unit tests in `docs/02_management/unit_test_cases.md`, reviewed the source code report against the live repository, and verified the final build/test workflow including </w:t>
             </w:r>
             <w:proofErr w:type="spellStart"/>
             <w:r>
@@ -5047,6 +4983,7 @@
   <w:style w:type="character" w:default="1" w:styleId="DefaultParagraphFont">
     <w:name w:val="Default Paragraph Font"/>
     <w:uiPriority w:val="1"/>
+    <w:semiHidden/>
     <w:unhideWhenUsed/>
   </w:style>
   <w:style w:type="table" w:default="1" w:styleId="TableNormal">

</xml_diff>